<commit_message>
M2: BM_PREP uppdaterat - lade till uppgift 2 i submissions och study summary
</commit_message>
<xml_diff>
--- a/engelska/webbserverutveckling/BM_PREP/MY_SUBMISSIONS_Prep.docx
+++ b/engelska/webbserverutveckling/BM_PREP/MY_SUBMISSIONS_Prep.docx
@@ -758,6 +758,306 @@
         <w:t>-&gt; I would add a QR code so people can scan and download easily. I would also move the CSS to its own file if the site gets bigger. Maybe add animations on the feature cards and a customer reviews section.</w:t>
       </w:r>
     </w:p>
+    <w:p>
+      <w:pPr>
+        <w:pStyle w:val="Heading1"/>
+        <w:spacing w:before="120" w:after="40"/>
+      </w:pPr>
+      <w:r>
+        <w:rPr>
+          <w:color w:val="C0392B"/>
+          <w:sz w:val="22"/>
+        </w:rPr>
+        <w:t>Uppgift 2 - M2 Mediagalleri + Felfix (Lararbedomd)</w:t>
+      </w:r>
+    </w:p>
+    <w:p>
+      <w:pPr>
+        <w:spacing w:after="20"/>
+      </w:pPr>
+      <w:r>
+        <w:rPr>
+          <w:sz w:val="18"/>
+        </w:rPr>
+        <w:t>Same Samis Jackets brand and dark/gold theme as Uppgift 1 - this is a continuation, not a new project.</w:t>
+      </w:r>
+    </w:p>
+    <w:p>
+      <w:pPr>
+        <w:spacing w:after="40" w:before="20"/>
+      </w:pPr>
+      <w:r>
+        <w:rPr>
+          <w:b/>
+          <w:sz w:val="18"/>
+        </w:rPr>
+        <w:t>Q: What does Del 1 contain?</w:t>
+        <w:br/>
+      </w:r>
+      <w:r>
+        <w:rPr>
+          <w:color w:val="226622"/>
+          <w:sz w:val="18"/>
+        </w:rPr>
+        <w:t>-&gt; A G&amp;S Mediagalleri website with 9 pages (start + 8 demos): Jacka (img), Jingle (audio), Reklam (video), Logga (canvas), Butik (background-image), Catwalk (background-video), 3D-jacka (Three.js), VR-butik (A-Frame). All pages share a sticky nav and the same dark/gold theme as the GS appen page.</w:t>
+      </w:r>
+    </w:p>
+    <w:p>
+      <w:pPr>
+        <w:spacing w:after="40" w:before="20"/>
+      </w:pPr>
+      <w:r>
+        <w:rPr>
+          <w:b/>
+          <w:sz w:val="18"/>
+        </w:rPr>
+        <w:t>Q: What are the bonuses?</w:t>
+        <w:br/>
+      </w:r>
+      <w:r>
+        <w:rPr>
+          <w:color w:val="226622"/>
+          <w:sz w:val="18"/>
+        </w:rPr>
+        <w:t>-&gt; Theme button (dark default / light) that saves the choice in localStorage so it stays across pages. Animated CSS background on the start page that loops between gold and black using @keyframes.</w:t>
+      </w:r>
+    </w:p>
+    <w:p>
+      <w:pPr>
+        <w:spacing w:after="40" w:before="0"/>
+        <w:ind w:left="283"/>
+      </w:pPr>
+      <w:r>
+        <w:rPr>
+          <w:rFonts w:ascii="Consolas" w:hAnsi="Consolas"/>
+          <w:color w:val="1A5CB0"/>
+          <w:sz w:val="16"/>
+        </w:rPr>
+        <w:t>CODE: localStorage.setItem("tema", "light");  // remembers theme between pages</w:t>
+      </w:r>
+    </w:p>
+    <w:p>
+      <w:pPr>
+        <w:spacing w:after="40" w:before="0"/>
+        <w:ind w:left="283"/>
+      </w:pPr>
+      <w:r>
+        <w:rPr>
+          <w:rFonts w:ascii="Consolas" w:hAnsi="Consolas"/>
+          <w:color w:val="1A5CB0"/>
+          <w:sz w:val="16"/>
+        </w:rPr>
+        <w:t>CODE: @keyframes rorelse { 0%{background-position:0% 50%} 50%{100% 50%} 100%{0% 50%} }</w:t>
+      </w:r>
+    </w:p>
+    <w:p>
+      <w:pPr>
+        <w:spacing w:after="40" w:before="20"/>
+      </w:pPr>
+      <w:r>
+        <w:rPr>
+          <w:b/>
+          <w:sz w:val="18"/>
+        </w:rPr>
+        <w:t>Q: How is Del 1 connected to Uppgift 1?</w:t>
+        <w:br/>
+      </w:r>
+      <w:r>
+        <w:rPr>
+          <w:color w:val="226622"/>
+          <w:sz w:val="18"/>
+        </w:rPr>
+        <w:t>-&gt; Same brand (Samis Jackets / G&amp;S), same color palette (#111 background, #c8a96e gold), same theme button id (tema-btn) with the same dark-default behavior, same JS style (var, ==). It is the next page in the same site, not a new idea.</w:t>
+      </w:r>
+    </w:p>
+    <w:p>
+      <w:pPr>
+        <w:spacing w:after="40" w:before="20"/>
+      </w:pPr>
+      <w:r>
+        <w:rPr>
+          <w:b/>
+          <w:sz w:val="18"/>
+        </w:rPr>
+        <w:t>Q: Canvas page - what does it draw?</w:t>
+        <w:br/>
+      </w:r>
+      <w:r>
+        <w:rPr>
+          <w:color w:val="226622"/>
+          <w:sz w:val="18"/>
+        </w:rPr>
+        <w:t>-&gt; It draws the G&amp;S logo box - a gold rectangle, a black inner rectangle, the text "G&amp;S" in gold and "by Samis Jackets" underneath. The idea is that we could later draw product badges (NY, REA, VIP) on product images this way.</w:t>
+      </w:r>
+    </w:p>
+    <w:p>
+      <w:pPr>
+        <w:spacing w:after="40" w:before="0"/>
+        <w:ind w:left="283"/>
+      </w:pPr>
+      <w:r>
+        <w:rPr>
+          <w:rFonts w:ascii="Consolas" w:hAnsi="Consolas"/>
+          <w:color w:val="1A5CB0"/>
+          <w:sz w:val="16"/>
+        </w:rPr>
+        <w:t>CODE: ctx.fillStyle = "#c8a96e"; ctx.fillRect(20, 20, 280, 140);</w:t>
+      </w:r>
+    </w:p>
+    <w:p>
+      <w:pPr>
+        <w:spacing w:after="40" w:before="20"/>
+      </w:pPr>
+      <w:r>
+        <w:rPr>
+          <w:b/>
+          <w:sz w:val="18"/>
+        </w:rPr>
+        <w:t>Q: Three.js page - what is it for?</w:t>
+        <w:br/>
+      </w:r>
+      <w:r>
+        <w:rPr>
+          <w:color w:val="226622"/>
+          <w:sz w:val="18"/>
+        </w:rPr>
+        <w:t>-&gt; A textured cube that rotates - meant as a future 360-degree product view. The texture is loaded with TextureLoader and applied to a BoxGeometry. The animation loop uses requestAnimationFrame to rotate the cube on x and y.</w:t>
+      </w:r>
+    </w:p>
+    <w:p>
+      <w:pPr>
+        <w:spacing w:after="40" w:before="20"/>
+      </w:pPr>
+      <w:r>
+        <w:rPr>
+          <w:b/>
+          <w:sz w:val="18"/>
+        </w:rPr>
+        <w:t>Q: A-Frame page - what is in the scene?</w:t>
+        <w:br/>
+      </w:r>
+      <w:r>
+        <w:rPr>
+          <w:color w:val="226622"/>
+          <w:sz w:val="18"/>
+        </w:rPr>
+        <w:t>-&gt; A 3D scene with a gold rotating box, a red sphere, a dark plane as floor, a black sky and a gold text "Samis Jackets - VR demo". Idea: a mini VR butik people can walk around in.</w:t>
+      </w:r>
+    </w:p>
+    <w:p>
+      <w:pPr>
+        <w:spacing w:after="40" w:before="20"/>
+      </w:pPr>
+      <w:r>
+        <w:rPr>
+          <w:b/>
+          <w:sz w:val="18"/>
+        </w:rPr>
+        <w:t>Q: What was Del 2?</w:t>
+        <w:br/>
+      </w:r>
+      <w:r>
+        <w:rPr>
+          <w:color w:val="226622"/>
+          <w:sz w:val="18"/>
+        </w:rPr>
+        <w:t>-&gt; Three buggy files from the teachers GitHub - I had to find all the bugs and fix them with Swedish comments explaining each fix.</w:t>
+      </w:r>
+    </w:p>
+    <w:p>
+      <w:pPr>
+        <w:spacing w:after="40" w:before="20"/>
+      </w:pPr>
+      <w:r>
+        <w:rPr>
+          <w:b/>
+          <w:sz w:val="18"/>
+        </w:rPr>
+        <w:t>Q: Worst bug in script.js?</w:t>
+        <w:br/>
+      </w:r>
+      <w:r>
+        <w:rPr>
+          <w:color w:val="226622"/>
+          <w:sz w:val="18"/>
+        </w:rPr>
+        <w:t>-&gt; A missing closing bracket } after console.log(x). That made the whole script crash with a SyntaxError - nothing in the file ran at all. I added the } and changed var to const, added semicolons, gave the function a real name (visaTal instead of test) and actually called it.</w:t>
+      </w:r>
+    </w:p>
+    <w:p>
+      <w:pPr>
+        <w:spacing w:after="40" w:before="0"/>
+        <w:ind w:left="283"/>
+      </w:pPr>
+      <w:r>
+        <w:rPr>
+          <w:rFonts w:ascii="Consolas" w:hAnsi="Consolas"/>
+          <w:color w:val="1A5CB0"/>
+          <w:sz w:val="16"/>
+        </w:rPr>
+        <w:t>CODE: function visaTal() { const x = 10; console.log(x); }  // FIXED: added }</w:t>
+      </w:r>
+    </w:p>
+    <w:p>
+      <w:pPr>
+        <w:spacing w:after="40" w:before="20"/>
+      </w:pPr>
+      <w:r>
+        <w:rPr>
+          <w:b/>
+          <w:sz w:val="18"/>
+        </w:rPr>
+        <w:t>Q: Worst HTML bugs?</w:t>
+        <w:br/>
+      </w:r>
+      <w:r>
+        <w:rPr>
+          <w:color w:val="226622"/>
+          <w:sz w:val="18"/>
+        </w:rPr>
+        <w:t>-&gt; No DOCTYPE, no charset, no viewport, img with no alt and a missing image, input with no label, vague "Klicka har" link, useless title. I fixed all of them and explained each one with a Swedish comment.</w:t>
+      </w:r>
+    </w:p>
+    <w:p>
+      <w:pPr>
+        <w:spacing w:after="40" w:before="20"/>
+      </w:pPr>
+      <w:r>
+        <w:rPr>
+          <w:b/>
+          <w:sz w:val="18"/>
+        </w:rPr>
+        <w:t>Q: Worst CSS bugs?</w:t>
+        <w:br/>
+      </w:r>
+      <w:r>
+        <w:rPr>
+          <w:color w:val="226622"/>
+          <w:sz w:val="18"/>
+        </w:rPr>
+        <w:t>-&gt; lightgray text on #eee background - basically unreadable, fails accessibility. font-size: 9px way too small. lightblue links also unreadable. No responsive rules at all. I changed text to #222, font to 16px, links to dark blue and added a media query.</w:t>
+      </w:r>
+    </w:p>
+    <w:p>
+      <w:pPr>
+        <w:spacing w:after="40" w:before="20"/>
+      </w:pPr>
+      <w:r>
+        <w:rPr>
+          <w:b/>
+          <w:sz w:val="18"/>
+        </w:rPr>
+        <w:t>Q: What did you learn from Del 2?</w:t>
+        <w:br/>
+      </w:r>
+      <w:r>
+        <w:rPr>
+          <w:color w:val="226622"/>
+          <w:sz w:val="18"/>
+        </w:rPr>
+        <w:t>-&gt; Always open the browser console when something does not work - a missing } showed up immediately as a SyntaxError. Always put alt on images and label on inputs. Always check color contrast.</w:t>
+      </w:r>
+    </w:p>
     <w:sectPr>
       <w:pgSz w:w="12240" w:h="15840"/>
       <w:pgMar w:top="680" w:right="850" w:bottom="680" w:left="850" w:header="720" w:footer="720" w:gutter="0"/>

</xml_diff>